<commit_message>
Modified document - quaternions
</commit_message>
<xml_diff>
--- a/Doc/kwaterniony.docx
+++ b/Doc/kwaterniony.docx
@@ -70,34 +70,7 @@
         </w:rPr>
       </w:pPr>
       <w:r>
-        <w:t>q</w:t>
-      </w:r>
-      <w:r>
-        <w:t>2</w:t>
-      </w:r>
-      <w:r>
-        <w:t xml:space="preserve"> = w</w:t>
-      </w:r>
-      <w:r>
-        <w:t>2</w:t>
-      </w:r>
-      <w:r>
-        <w:t xml:space="preserve"> + ix</w:t>
-      </w:r>
-      <w:r>
-        <w:t>2</w:t>
-      </w:r>
-      <w:r>
-        <w:t xml:space="preserve"> + jy</w:t>
-      </w:r>
-      <w:r>
-        <w:t>2</w:t>
-      </w:r>
-      <w:r>
-        <w:t xml:space="preserve"> + kz</w:t>
-      </w:r>
-      <w:r>
-        <w:t xml:space="preserve">2 = w2 + </w:t>
+        <w:t xml:space="preserve">q2 = w2 + ix2 + jy2 + kz2 = w2 + </w:t>
       </w:r>
       <w:r>
         <w:rPr>
@@ -113,14 +86,7 @@
           <w:b/>
           <w:bCs/>
         </w:rPr>
-        <w:t>v</w:t>
-      </w:r>
-      <w:r>
-        <w:rPr>
-          <w:b/>
-          <w:bCs/>
-        </w:rPr>
-        <w:t>2</w:t>
+        <w:t>v2</w:t>
       </w:r>
       <w:r>
         <w:t xml:space="preserve"> = [x</w:t>
@@ -466,13 +432,7 @@
             <w:rPr>
               <w:rFonts w:ascii="Cambria Math" w:hAnsi="Cambria Math"/>
             </w:rPr>
-            <m:t>=</m:t>
-          </m:r>
-          <m:r>
-            <w:rPr>
-              <w:rFonts w:ascii="Cambria Math" w:hAnsi="Cambria Math"/>
-            </w:rPr>
-            <m:t>i</m:t>
+            <m:t>=i</m:t>
           </m:r>
           <m:d>
             <m:dPr>
@@ -532,19 +492,7 @@
         </w:rPr>
       </w:pPr>
       <w:r>
-        <w:t>q = q1 * q2 = (</w:t>
-      </w:r>
-      <w:r>
-        <w:t>w1 + ix1 + jy1 + kz1</w:t>
-      </w:r>
-      <w:r>
-        <w:t>) * (</w:t>
-      </w:r>
-      <w:r>
-        <w:t>w2 + ix2 + jy2 + kz2</w:t>
-      </w:r>
-      <w:r>
-        <w:t>) = w1w2 + w1</w:t>
+        <w:t>q = q1 * q2 = (w1 + ix1 + jy1 + kz1) * (w2 + ix2 + jy2 + kz2) = w1w2 + w1</w:t>
       </w:r>
       <w:r>
         <w:rPr>
@@ -643,10 +591,7 @@
         <w:t xml:space="preserve">z1x2 – iz1y2 – z1z2 = </w:t>
       </w:r>
       <w:r>
-        <w:t xml:space="preserve">w1w2 </w:t>
-      </w:r>
-      <w:r>
-        <w:t xml:space="preserve">- </w:t>
+        <w:t xml:space="preserve">w1w2 - </w:t>
       </w:r>
       <m:oMath>
         <m:r>
@@ -678,10 +623,7 @@
         </m:r>
       </m:oMath>
       <w:r>
-        <w:t xml:space="preserve"> </w:t>
-      </w:r>
-      <w:r>
-        <w:t>+ w1</w:t>
+        <w:t xml:space="preserve"> + w1</w:t>
       </w:r>
       <w:r>
         <w:rPr>
@@ -705,14 +647,7 @@
           <w:b/>
           <w:bCs/>
         </w:rPr>
-        <w:t>v2</w:t>
-      </w:r>
-      <w:r>
-        <w:rPr>
-          <w:b/>
-          <w:bCs/>
-        </w:rPr>
-        <w:t xml:space="preserve"> </w:t>
+        <w:t xml:space="preserve">v2 </w:t>
       </w:r>
       <w:r>
         <w:t xml:space="preserve">+ </w:t>
@@ -722,13 +657,7 @@
           <w:rPr>
             <w:rFonts w:ascii="Cambria Math" w:hAnsi="Cambria Math"/>
           </w:rPr>
-          <m:t>v1×v</m:t>
-        </m:r>
-        <m:r>
-          <w:rPr>
-            <w:rFonts w:ascii="Cambria Math" w:hAnsi="Cambria Math"/>
-          </w:rPr>
-          <m:t>2</m:t>
+          <m:t>v1×v2</m:t>
         </m:r>
       </m:oMath>
     </w:p>
@@ -742,7 +671,21 @@
         <w:rPr>
           <w:rFonts w:eastAsiaTheme="minorEastAsia"/>
         </w:rPr>
-        <w:t>z = |z|exp(i</w:t>
+        <w:t>z = |</w:t>
+      </w:r>
+      <w:proofErr w:type="spellStart"/>
+      <w:r>
+        <w:rPr>
+          <w:rFonts w:eastAsiaTheme="minorEastAsia"/>
+        </w:rPr>
+        <w:t>z|exp</w:t>
+      </w:r>
+      <w:proofErr w:type="spellEnd"/>
+      <w:r>
+        <w:rPr>
+          <w:rFonts w:eastAsiaTheme="minorEastAsia"/>
+        </w:rPr>
+        <w:t>(i</w:t>
       </w:r>
       <w:r>
         <w:rPr>
@@ -761,34 +704,143 @@
         <w:rPr>
           <w:rFonts w:eastAsiaTheme="minorEastAsia"/>
         </w:rPr>
-        <w:t xml:space="preserve">z’ = z*exp(i * theta) = </w:t>
-      </w:r>
+        <w:t>z’ = z*</w:t>
+      </w:r>
+      <w:proofErr w:type="spellStart"/>
+      <w:proofErr w:type="gramStart"/>
       <w:r>
         <w:rPr>
           <w:rFonts w:eastAsiaTheme="minorEastAsia"/>
         </w:rPr>
-        <w:t>|z|exp(i*phi)</w:t>
-      </w:r>
+        <w:t>exp</w:t>
+      </w:r>
+      <w:proofErr w:type="spellEnd"/>
       <w:r>
         <w:rPr>
           <w:rFonts w:eastAsiaTheme="minorEastAsia"/>
         </w:rPr>
-        <w:t xml:space="preserve"> * </w:t>
-      </w:r>
+        <w:t>(</w:t>
+      </w:r>
+      <w:proofErr w:type="gramEnd"/>
       <w:r>
         <w:rPr>
           <w:rFonts w:eastAsiaTheme="minorEastAsia"/>
         </w:rPr>
-        <w:t>exp(i * theta)</w:t>
-      </w:r>
+        <w:t xml:space="preserve">i * </w:t>
+      </w:r>
+      <w:proofErr w:type="spellStart"/>
       <w:r>
         <w:rPr>
           <w:rFonts w:eastAsiaTheme="minorEastAsia"/>
         </w:rPr>
-        <w:t xml:space="preserve"> = |z|exp(i * (phi + theta))</w:t>
+        <w:t>theta</w:t>
+      </w:r>
+      <w:proofErr w:type="spellEnd"/>
+      <w:r>
+        <w:rPr>
+          <w:rFonts w:eastAsiaTheme="minorEastAsia"/>
+        </w:rPr>
+        <w:t>) = |</w:t>
+      </w:r>
+      <w:proofErr w:type="spellStart"/>
+      <w:r>
+        <w:rPr>
+          <w:rFonts w:eastAsiaTheme="minorEastAsia"/>
+        </w:rPr>
+        <w:t>z|exp</w:t>
+      </w:r>
+      <w:proofErr w:type="spellEnd"/>
+      <w:r>
+        <w:rPr>
+          <w:rFonts w:eastAsiaTheme="minorEastAsia"/>
+        </w:rPr>
+        <w:t xml:space="preserve">(i*phi) * </w:t>
+      </w:r>
+      <w:proofErr w:type="spellStart"/>
+      <w:proofErr w:type="gramStart"/>
+      <w:r>
+        <w:rPr>
+          <w:rFonts w:eastAsiaTheme="minorEastAsia"/>
+        </w:rPr>
+        <w:t>exp</w:t>
+      </w:r>
+      <w:proofErr w:type="spellEnd"/>
+      <w:r>
+        <w:rPr>
+          <w:rFonts w:eastAsiaTheme="minorEastAsia"/>
+        </w:rPr>
+        <w:t>(</w:t>
+      </w:r>
+      <w:proofErr w:type="gramEnd"/>
+      <w:r>
+        <w:rPr>
+          <w:rFonts w:eastAsiaTheme="minorEastAsia"/>
+        </w:rPr>
+        <w:t xml:space="preserve">i * </w:t>
+      </w:r>
+      <w:proofErr w:type="spellStart"/>
+      <w:r>
+        <w:rPr>
+          <w:rFonts w:eastAsiaTheme="minorEastAsia"/>
+        </w:rPr>
+        <w:t>theta</w:t>
+      </w:r>
+      <w:proofErr w:type="spellEnd"/>
+      <w:r>
+        <w:rPr>
+          <w:rFonts w:eastAsiaTheme="minorEastAsia"/>
+        </w:rPr>
+        <w:t>) = |</w:t>
+      </w:r>
+      <w:proofErr w:type="spellStart"/>
+      <w:r>
+        <w:rPr>
+          <w:rFonts w:eastAsiaTheme="minorEastAsia"/>
+        </w:rPr>
+        <w:t>z|</w:t>
+      </w:r>
+      <w:proofErr w:type="gramStart"/>
+      <w:r>
+        <w:rPr>
+          <w:rFonts w:eastAsiaTheme="minorEastAsia"/>
+        </w:rPr>
+        <w:t>exp</w:t>
+      </w:r>
+      <w:proofErr w:type="spellEnd"/>
+      <w:r>
+        <w:rPr>
+          <w:rFonts w:eastAsiaTheme="minorEastAsia"/>
+        </w:rPr>
+        <w:t>(</w:t>
+      </w:r>
+      <w:proofErr w:type="gramEnd"/>
+      <w:r>
+        <w:rPr>
+          <w:rFonts w:eastAsiaTheme="minorEastAsia"/>
+        </w:rPr>
+        <w:t xml:space="preserve">i * (phi + </w:t>
+      </w:r>
+      <w:proofErr w:type="spellStart"/>
+      <w:r>
+        <w:rPr>
+          <w:rFonts w:eastAsiaTheme="minorEastAsia"/>
+        </w:rPr>
+        <w:t>theta</w:t>
+      </w:r>
+      <w:proofErr w:type="spellEnd"/>
+      <w:r>
+        <w:rPr>
+          <w:rFonts w:eastAsiaTheme="minorEastAsia"/>
+        </w:rPr>
+        <w:t>))</w:t>
       </w:r>
     </w:p>
     <w:p>
+      <w:pPr>
+        <w:rPr>
+          <w:rFonts w:eastAsiaTheme="minorEastAsia"/>
+        </w:rPr>
+      </w:pPr>
       <m:oMathPara>
         <m:oMath>
           <m:r>
@@ -1198,6 +1250,901 @@
         </m:oMath>
       </m:oMathPara>
     </w:p>
+    <w:p>
+      <w:pPr>
+        <w:rPr>
+          <w:b/>
+          <w:bCs/>
+        </w:rPr>
+      </w:pPr>
+      <w:r>
+        <w:rPr>
+          <w:b/>
+          <w:bCs/>
+        </w:rPr>
+        <w:t>1. Jak działa układ globalny (rodzica)?</w:t>
+      </w:r>
+    </w:p>
+    <w:p>
+      <w:r>
+        <w:t>Jeśli obracasz obiekt w układzie rodzica (osie się NIE obracają wraz z obiektem), to każda kolejna rotacja jest dokładana „od zewnątrz”.</w:t>
+      </w:r>
+      <w:r>
+        <w:br/>
+        <w:t xml:space="preserve">Chcesz wykonać sekwencję obrotów formatu FBX, czyli </w:t>
+      </w:r>
+      <w:r>
+        <w:rPr>
+          <w:b/>
+          <w:bCs/>
+        </w:rPr>
+        <w:t>najpierw X, potem Y, na końcu Z</w:t>
+      </w:r>
+      <w:r>
+        <w:t xml:space="preserve"> w stałym układzie rodzica.</w:t>
+      </w:r>
+    </w:p>
+    <w:p>
+      <w:r>
+        <w:t>Matematycznie, jeśli nakładasz na wektor rotacje jedna po drugiej:</w:t>
+      </w:r>
+    </w:p>
+    <w:p>
+      <w:pPr>
+        <w:numPr>
+          <w:ilvl w:val="0"/>
+          <w:numId w:val="1"/>
+        </w:numPr>
+        <w:rPr>
+          <w:rFonts w:eastAsiaTheme="minorEastAsia"/>
+        </w:rPr>
+      </w:pPr>
+      <w:r>
+        <w:t xml:space="preserve">Najpierw obracasz przez </w:t>
+      </w:r>
+      <m:oMath>
+        <m:sSub>
+          <m:sSubPr>
+            <m:ctrlPr>
+              <w:rPr>
+                <w:rFonts w:ascii="Cambria Math" w:hAnsi="Cambria Math"/>
+                <w:i/>
+                <w:iCs/>
+              </w:rPr>
+            </m:ctrlPr>
+          </m:sSubPr>
+          <m:e>
+            <m:r>
+              <w:rPr>
+                <w:rFonts w:ascii="Cambria Math" w:hAnsi="Cambria Math"/>
+              </w:rPr>
+              <m:t>q</m:t>
+            </m:r>
+          </m:e>
+          <m:sub>
+            <m:r>
+              <w:rPr>
+                <w:rFonts w:ascii="Cambria Math" w:hAnsi="Cambria Math"/>
+              </w:rPr>
+              <m:t>X</m:t>
+            </m:r>
+          </m:sub>
+        </m:sSub>
+        <m:r>
+          <w:rPr>
+            <w:rFonts w:ascii="Cambria Math" w:hAnsi="Cambria Math"/>
+          </w:rPr>
+          <m:t xml:space="preserve">: </m:t>
+        </m:r>
+        <m:sSup>
+          <m:sSupPr>
+            <m:ctrlPr>
+              <w:rPr>
+                <w:rFonts w:ascii="Cambria Math" w:hAnsi="Cambria Math"/>
+                <w:i/>
+                <w:iCs/>
+              </w:rPr>
+            </m:ctrlPr>
+          </m:sSupPr>
+          <m:e>
+            <m:r>
+              <w:rPr>
+                <w:rFonts w:ascii="Cambria Math" w:hAnsi="Cambria Math"/>
+              </w:rPr>
+              <m:t>v</m:t>
+            </m:r>
+          </m:e>
+          <m:sup>
+            <m:r>
+              <w:rPr>
+                <w:rFonts w:ascii="Cambria Math" w:hAnsi="Cambria Math"/>
+              </w:rPr>
+              <m:t>'</m:t>
+            </m:r>
+          </m:sup>
+        </m:sSup>
+        <m:r>
+          <w:rPr>
+            <w:rFonts w:ascii="Cambria Math" w:hAnsi="Cambria Math"/>
+          </w:rPr>
+          <m:t xml:space="preserve">= </m:t>
+        </m:r>
+        <m:sSub>
+          <m:sSubPr>
+            <m:ctrlPr>
+              <w:rPr>
+                <w:rFonts w:ascii="Cambria Math" w:hAnsi="Cambria Math"/>
+                <w:i/>
+                <w:iCs/>
+              </w:rPr>
+            </m:ctrlPr>
+          </m:sSubPr>
+          <m:e>
+            <m:r>
+              <w:rPr>
+                <w:rFonts w:ascii="Cambria Math" w:hAnsi="Cambria Math"/>
+              </w:rPr>
+              <m:t>q</m:t>
+            </m:r>
+          </m:e>
+          <m:sub>
+            <m:r>
+              <w:rPr>
+                <w:rFonts w:ascii="Cambria Math" w:hAnsi="Cambria Math"/>
+              </w:rPr>
+              <m:t>X</m:t>
+            </m:r>
+          </m:sub>
+        </m:sSub>
+        <m:r>
+          <w:rPr>
+            <w:rFonts w:ascii="Cambria Math" w:hAnsi="Cambria Math"/>
+          </w:rPr>
+          <m:t xml:space="preserve">v </m:t>
+        </m:r>
+        <m:sSubSup>
+          <m:sSubSupPr>
+            <m:ctrlPr>
+              <w:rPr>
+                <w:rFonts w:ascii="Cambria Math" w:hAnsi="Cambria Math"/>
+                <w:i/>
+                <w:iCs/>
+              </w:rPr>
+            </m:ctrlPr>
+          </m:sSubSupPr>
+          <m:e>
+            <m:r>
+              <w:rPr>
+                <w:rFonts w:ascii="Cambria Math" w:hAnsi="Cambria Math"/>
+              </w:rPr>
+              <m:t>q</m:t>
+            </m:r>
+          </m:e>
+          <m:sub>
+            <m:r>
+              <w:rPr>
+                <w:rFonts w:ascii="Cambria Math" w:hAnsi="Cambria Math"/>
+              </w:rPr>
+              <m:t>X</m:t>
+            </m:r>
+          </m:sub>
+          <m:sup>
+            <m:r>
+              <w:rPr>
+                <w:rFonts w:ascii="Cambria Math" w:hAnsi="Cambria Math"/>
+              </w:rPr>
+              <m:t>-1</m:t>
+            </m:r>
+          </m:sup>
+        </m:sSubSup>
+      </m:oMath>
+    </w:p>
+    <w:p>
+      <w:pPr>
+        <w:numPr>
+          <w:ilvl w:val="0"/>
+          <w:numId w:val="1"/>
+        </w:numPr>
+        <w:rPr>
+          <w:rFonts w:eastAsiaTheme="minorEastAsia"/>
+        </w:rPr>
+      </w:pPr>
+      <w:r>
+        <w:t xml:space="preserve">Potem ten wynik obracasz w układzie globalnym przez </w:t>
+      </w:r>
+      <m:oMath>
+        <m:sSub>
+          <m:sSubPr>
+            <m:ctrlPr>
+              <w:rPr>
+                <w:rFonts w:ascii="Cambria Math" w:hAnsi="Cambria Math"/>
+                <w:i/>
+              </w:rPr>
+            </m:ctrlPr>
+          </m:sSubPr>
+          <m:e>
+            <m:r>
+              <w:rPr>
+                <w:rFonts w:ascii="Cambria Math" w:hAnsi="Cambria Math"/>
+              </w:rPr>
+              <m:t>q</m:t>
+            </m:r>
+          </m:e>
+          <m:sub>
+            <m:r>
+              <w:rPr>
+                <w:rFonts w:ascii="Cambria Math" w:hAnsi="Cambria Math"/>
+              </w:rPr>
+              <m:t>Y</m:t>
+            </m:r>
+          </m:sub>
+        </m:sSub>
+        <m:r>
+          <w:rPr>
+            <w:rFonts w:ascii="Cambria Math" w:hAnsi="Cambria Math"/>
+          </w:rPr>
+          <m:t xml:space="preserve">: </m:t>
+        </m:r>
+        <m:sSup>
+          <m:sSupPr>
+            <m:ctrlPr>
+              <w:rPr>
+                <w:rFonts w:ascii="Cambria Math" w:hAnsi="Cambria Math"/>
+                <w:i/>
+              </w:rPr>
+            </m:ctrlPr>
+          </m:sSupPr>
+          <m:e>
+            <m:r>
+              <w:rPr>
+                <w:rFonts w:ascii="Cambria Math" w:hAnsi="Cambria Math"/>
+              </w:rPr>
+              <m:t>v</m:t>
+            </m:r>
+          </m:e>
+          <m:sup>
+            <m:r>
+              <w:rPr>
+                <w:rFonts w:ascii="Cambria Math" w:hAnsi="Cambria Math"/>
+              </w:rPr>
+              <m:t>'</m:t>
+            </m:r>
+            <m:r>
+              <w:rPr>
+                <w:rFonts w:ascii="Cambria Math" w:hAnsi="Cambria Math"/>
+              </w:rPr>
+              <m:t>'</m:t>
+            </m:r>
+          </m:sup>
+        </m:sSup>
+        <m:r>
+          <w:rPr>
+            <w:rFonts w:ascii="Cambria Math" w:hAnsi="Cambria Math"/>
+          </w:rPr>
+          <m:t xml:space="preserve">= </m:t>
+        </m:r>
+        <m:sSub>
+          <m:sSubPr>
+            <m:ctrlPr>
+              <w:rPr>
+                <w:rFonts w:ascii="Cambria Math" w:hAnsi="Cambria Math"/>
+                <w:i/>
+              </w:rPr>
+            </m:ctrlPr>
+          </m:sSubPr>
+          <m:e>
+            <m:r>
+              <w:rPr>
+                <w:rFonts w:ascii="Cambria Math" w:hAnsi="Cambria Math"/>
+              </w:rPr>
+              <m:t>q</m:t>
+            </m:r>
+          </m:e>
+          <m:sub>
+            <m:r>
+              <w:rPr>
+                <w:rFonts w:ascii="Cambria Math" w:hAnsi="Cambria Math"/>
+              </w:rPr>
+              <m:t>Y</m:t>
+            </m:r>
+          </m:sub>
+        </m:sSub>
+        <m:d>
+          <m:dPr>
+            <m:ctrlPr>
+              <w:rPr>
+                <w:rFonts w:ascii="Cambria Math" w:hAnsi="Cambria Math"/>
+                <w:i/>
+              </w:rPr>
+            </m:ctrlPr>
+          </m:dPr>
+          <m:e>
+            <m:sSub>
+              <m:sSubPr>
+                <m:ctrlPr>
+                  <w:rPr>
+                    <w:rFonts w:ascii="Cambria Math" w:hAnsi="Cambria Math"/>
+                    <w:i/>
+                  </w:rPr>
+                </m:ctrlPr>
+              </m:sSubPr>
+              <m:e>
+                <m:r>
+                  <w:rPr>
+                    <w:rFonts w:ascii="Cambria Math" w:hAnsi="Cambria Math"/>
+                  </w:rPr>
+                  <m:t>q</m:t>
+                </m:r>
+              </m:e>
+              <m:sub>
+                <m:r>
+                  <w:rPr>
+                    <w:rFonts w:ascii="Cambria Math" w:hAnsi="Cambria Math"/>
+                  </w:rPr>
+                  <m:t>X</m:t>
+                </m:r>
+              </m:sub>
+            </m:sSub>
+            <m:r>
+              <w:rPr>
+                <w:rFonts w:ascii="Cambria Math" w:hAnsi="Cambria Math"/>
+              </w:rPr>
+              <m:t xml:space="preserve">v </m:t>
+            </m:r>
+            <m:sSubSup>
+              <m:sSubSupPr>
+                <m:ctrlPr>
+                  <w:rPr>
+                    <w:rFonts w:ascii="Cambria Math" w:hAnsi="Cambria Math"/>
+                    <w:i/>
+                  </w:rPr>
+                </m:ctrlPr>
+              </m:sSubSupPr>
+              <m:e>
+                <m:r>
+                  <w:rPr>
+                    <w:rFonts w:ascii="Cambria Math" w:hAnsi="Cambria Math"/>
+                  </w:rPr>
+                  <m:t>q</m:t>
+                </m:r>
+              </m:e>
+              <m:sub>
+                <m:r>
+                  <w:rPr>
+                    <w:rFonts w:ascii="Cambria Math" w:hAnsi="Cambria Math"/>
+                  </w:rPr>
+                  <m:t>X</m:t>
+                </m:r>
+              </m:sub>
+              <m:sup>
+                <m:r>
+                  <w:rPr>
+                    <w:rFonts w:ascii="Cambria Math" w:hAnsi="Cambria Math"/>
+                  </w:rPr>
+                  <m:t>-1</m:t>
+                </m:r>
+              </m:sup>
+            </m:sSubSup>
+          </m:e>
+        </m:d>
+        <m:sSubSup>
+          <m:sSubSupPr>
+            <m:ctrlPr>
+              <w:rPr>
+                <w:rFonts w:ascii="Cambria Math" w:hAnsi="Cambria Math"/>
+                <w:i/>
+              </w:rPr>
+            </m:ctrlPr>
+          </m:sSubSupPr>
+          <m:e>
+            <m:r>
+              <w:rPr>
+                <w:rFonts w:ascii="Cambria Math" w:hAnsi="Cambria Math"/>
+              </w:rPr>
+              <m:t>q</m:t>
+            </m:r>
+          </m:e>
+          <m:sub>
+            <m:r>
+              <w:rPr>
+                <w:rFonts w:ascii="Cambria Math" w:hAnsi="Cambria Math"/>
+              </w:rPr>
+              <m:t>Y</m:t>
+            </m:r>
+          </m:sub>
+          <m:sup>
+            <m:r>
+              <w:rPr>
+                <w:rFonts w:ascii="Cambria Math" w:hAnsi="Cambria Math"/>
+              </w:rPr>
+              <m:t>-1</m:t>
+            </m:r>
+          </m:sup>
+        </m:sSubSup>
+      </m:oMath>
+    </w:p>
+    <w:p>
+      <w:pPr>
+        <w:numPr>
+          <w:ilvl w:val="0"/>
+          <w:numId w:val="1"/>
+        </w:numPr>
+        <w:rPr>
+          <w:rFonts w:eastAsiaTheme="minorEastAsia"/>
+        </w:rPr>
+      </w:pPr>
+      <w:r>
+        <w:lastRenderedPageBreak/>
+        <w:t xml:space="preserve">Na końcu obracasz przez </w:t>
+      </w:r>
+      <m:oMath>
+        <m:sSub>
+          <m:sSubPr>
+            <m:ctrlPr>
+              <w:rPr>
+                <w:rFonts w:ascii="Cambria Math" w:hAnsi="Cambria Math"/>
+                <w:i/>
+              </w:rPr>
+            </m:ctrlPr>
+          </m:sSubPr>
+          <m:e>
+            <m:r>
+              <w:rPr>
+                <w:rFonts w:ascii="Cambria Math" w:hAnsi="Cambria Math"/>
+              </w:rPr>
+              <m:t>q</m:t>
+            </m:r>
+          </m:e>
+          <m:sub>
+            <m:r>
+              <w:rPr>
+                <w:rFonts w:ascii="Cambria Math" w:hAnsi="Cambria Math"/>
+              </w:rPr>
+              <m:t>Z</m:t>
+            </m:r>
+          </m:sub>
+        </m:sSub>
+        <m:r>
+          <w:rPr>
+            <w:rFonts w:ascii="Cambria Math" w:hAnsi="Cambria Math"/>
+          </w:rPr>
+          <m:t xml:space="preserve">: </m:t>
+        </m:r>
+        <m:sSup>
+          <m:sSupPr>
+            <m:ctrlPr>
+              <w:rPr>
+                <w:rFonts w:ascii="Cambria Math" w:hAnsi="Cambria Math"/>
+                <w:i/>
+              </w:rPr>
+            </m:ctrlPr>
+          </m:sSupPr>
+          <m:e>
+            <m:r>
+              <w:rPr>
+                <w:rFonts w:ascii="Cambria Math" w:hAnsi="Cambria Math"/>
+              </w:rPr>
+              <m:t>v</m:t>
+            </m:r>
+          </m:e>
+          <m:sup>
+            <m:r>
+              <w:rPr>
+                <w:rFonts w:ascii="Cambria Math" w:hAnsi="Cambria Math"/>
+              </w:rPr>
+              <m:t>'''</m:t>
+            </m:r>
+          </m:sup>
+        </m:sSup>
+        <m:r>
+          <w:rPr>
+            <w:rFonts w:ascii="Cambria Math" w:hAnsi="Cambria Math"/>
+          </w:rPr>
+          <m:t xml:space="preserve">= </m:t>
+        </m:r>
+        <m:sSub>
+          <m:sSubPr>
+            <m:ctrlPr>
+              <w:rPr>
+                <w:rFonts w:ascii="Cambria Math" w:hAnsi="Cambria Math"/>
+                <w:i/>
+              </w:rPr>
+            </m:ctrlPr>
+          </m:sSubPr>
+          <m:e>
+            <m:r>
+              <w:rPr>
+                <w:rFonts w:ascii="Cambria Math" w:hAnsi="Cambria Math"/>
+              </w:rPr>
+              <m:t>q</m:t>
+            </m:r>
+          </m:e>
+          <m:sub>
+            <m:r>
+              <w:rPr>
+                <w:rFonts w:ascii="Cambria Math" w:hAnsi="Cambria Math"/>
+              </w:rPr>
+              <m:t>Z</m:t>
+            </m:r>
+          </m:sub>
+        </m:sSub>
+        <m:d>
+          <m:dPr>
+            <m:ctrlPr>
+              <w:rPr>
+                <w:rFonts w:ascii="Cambria Math" w:hAnsi="Cambria Math"/>
+                <w:i/>
+              </w:rPr>
+            </m:ctrlPr>
+          </m:dPr>
+          <m:e>
+            <m:sSub>
+              <m:sSubPr>
+                <m:ctrlPr>
+                  <w:rPr>
+                    <w:rFonts w:ascii="Cambria Math" w:hAnsi="Cambria Math"/>
+                    <w:i/>
+                  </w:rPr>
+                </m:ctrlPr>
+              </m:sSubPr>
+              <m:e>
+                <m:r>
+                  <w:rPr>
+                    <w:rFonts w:ascii="Cambria Math" w:hAnsi="Cambria Math"/>
+                  </w:rPr>
+                  <m:t>q</m:t>
+                </m:r>
+              </m:e>
+              <m:sub>
+                <m:r>
+                  <w:rPr>
+                    <w:rFonts w:ascii="Cambria Math" w:hAnsi="Cambria Math"/>
+                  </w:rPr>
+                  <m:t>Y</m:t>
+                </m:r>
+              </m:sub>
+            </m:sSub>
+            <m:sSub>
+              <m:sSubPr>
+                <m:ctrlPr>
+                  <w:rPr>
+                    <w:rFonts w:ascii="Cambria Math" w:hAnsi="Cambria Math"/>
+                    <w:i/>
+                  </w:rPr>
+                </m:ctrlPr>
+              </m:sSubPr>
+              <m:e>
+                <m:r>
+                  <w:rPr>
+                    <w:rFonts w:ascii="Cambria Math" w:hAnsi="Cambria Math"/>
+                  </w:rPr>
+                  <m:t>q</m:t>
+                </m:r>
+              </m:e>
+              <m:sub>
+                <m:r>
+                  <w:rPr>
+                    <w:rFonts w:ascii="Cambria Math" w:hAnsi="Cambria Math"/>
+                  </w:rPr>
+                  <m:t>X</m:t>
+                </m:r>
+              </m:sub>
+            </m:sSub>
+            <m:r>
+              <w:rPr>
+                <w:rFonts w:ascii="Cambria Math" w:hAnsi="Cambria Math"/>
+              </w:rPr>
+              <m:t xml:space="preserve">v </m:t>
+            </m:r>
+            <m:sSubSup>
+              <m:sSubSupPr>
+                <m:ctrlPr>
+                  <w:rPr>
+                    <w:rFonts w:ascii="Cambria Math" w:hAnsi="Cambria Math"/>
+                    <w:i/>
+                  </w:rPr>
+                </m:ctrlPr>
+              </m:sSubSupPr>
+              <m:e>
+                <m:r>
+                  <w:rPr>
+                    <w:rFonts w:ascii="Cambria Math" w:hAnsi="Cambria Math"/>
+                  </w:rPr>
+                  <m:t>q</m:t>
+                </m:r>
+              </m:e>
+              <m:sub>
+                <m:r>
+                  <w:rPr>
+                    <w:rFonts w:ascii="Cambria Math" w:hAnsi="Cambria Math"/>
+                  </w:rPr>
+                  <m:t>X</m:t>
+                </m:r>
+              </m:sub>
+              <m:sup>
+                <m:r>
+                  <w:rPr>
+                    <w:rFonts w:ascii="Cambria Math" w:hAnsi="Cambria Math"/>
+                  </w:rPr>
+                  <m:t>-1</m:t>
+                </m:r>
+              </m:sup>
+            </m:sSubSup>
+            <m:sSubSup>
+              <m:sSubSupPr>
+                <m:ctrlPr>
+                  <w:rPr>
+                    <w:rFonts w:ascii="Cambria Math" w:hAnsi="Cambria Math"/>
+                    <w:i/>
+                  </w:rPr>
+                </m:ctrlPr>
+              </m:sSubSupPr>
+              <m:e>
+                <m:r>
+                  <w:rPr>
+                    <w:rFonts w:ascii="Cambria Math" w:hAnsi="Cambria Math"/>
+                  </w:rPr>
+                  <m:t>q</m:t>
+                </m:r>
+              </m:e>
+              <m:sub>
+                <m:r>
+                  <w:rPr>
+                    <w:rFonts w:ascii="Cambria Math" w:hAnsi="Cambria Math"/>
+                  </w:rPr>
+                  <m:t>Y</m:t>
+                </m:r>
+              </m:sub>
+              <m:sup>
+                <m:r>
+                  <w:rPr>
+                    <w:rFonts w:ascii="Cambria Math" w:hAnsi="Cambria Math"/>
+                  </w:rPr>
+                  <m:t>-1</m:t>
+                </m:r>
+              </m:sup>
+            </m:sSubSup>
+          </m:e>
+        </m:d>
+        <m:sSubSup>
+          <m:sSubSupPr>
+            <m:ctrlPr>
+              <w:rPr>
+                <w:rFonts w:ascii="Cambria Math" w:hAnsi="Cambria Math"/>
+                <w:i/>
+              </w:rPr>
+            </m:ctrlPr>
+          </m:sSubSupPr>
+          <m:e>
+            <m:r>
+              <w:rPr>
+                <w:rFonts w:ascii="Cambria Math" w:hAnsi="Cambria Math"/>
+              </w:rPr>
+              <m:t>q</m:t>
+            </m:r>
+          </m:e>
+          <m:sub>
+            <m:r>
+              <w:rPr>
+                <w:rFonts w:ascii="Cambria Math" w:hAnsi="Cambria Math"/>
+              </w:rPr>
+              <m:t>Z</m:t>
+            </m:r>
+          </m:sub>
+          <m:sup>
+            <m:r>
+              <w:rPr>
+                <w:rFonts w:ascii="Cambria Math" w:hAnsi="Cambria Math"/>
+              </w:rPr>
+              <m:t>-1</m:t>
+            </m:r>
+          </m:sup>
+        </m:sSubSup>
+      </m:oMath>
+    </w:p>
+    <w:p>
+      <w:r>
+        <w:t>Grupując kwaterniony, otrzymujesz wypadkowy kwaternion:</w:t>
+      </w:r>
+      <w:r>
+        <w:br/>
+      </w:r>
+      <m:oMathPara>
+        <m:oMath>
+          <m:sSub>
+            <m:sSubPr>
+              <m:ctrlPr>
+                <w:rPr>
+                  <w:rFonts w:ascii="Cambria Math" w:hAnsi="Cambria Math"/>
+                </w:rPr>
+              </m:ctrlPr>
+            </m:sSubPr>
+            <m:e>
+              <m:r>
+                <w:rPr>
+                  <w:rFonts w:ascii="Cambria Math" w:hAnsi="Cambria Math"/>
+                </w:rPr>
+                <m:t>q</m:t>
+              </m:r>
+            </m:e>
+            <m:sub>
+              <m:r>
+                <m:rPr>
+                  <m:sty m:val="p"/>
+                </m:rPr>
+                <w:rPr>
+                  <w:rFonts w:ascii="Cambria Math" w:hAnsi="Cambria Math"/>
+                </w:rPr>
+                <m:t>total</m:t>
+              </m:r>
+            </m:sub>
+          </m:sSub>
+          <m:r>
+            <w:rPr>
+              <w:rFonts w:ascii="Cambria Math" w:hAnsi="Cambria Math"/>
+            </w:rPr>
+            <m:t>=</m:t>
+          </m:r>
+          <m:sSub>
+            <m:sSubPr>
+              <m:ctrlPr>
+                <w:rPr>
+                  <w:rFonts w:ascii="Cambria Math" w:hAnsi="Cambria Math"/>
+                </w:rPr>
+              </m:ctrlPr>
+            </m:sSubPr>
+            <m:e>
+              <m:r>
+                <w:rPr>
+                  <w:rFonts w:ascii="Cambria Math" w:hAnsi="Cambria Math"/>
+                </w:rPr>
+                <m:t>q</m:t>
+              </m:r>
+            </m:e>
+            <m:sub>
+              <m:r>
+                <w:rPr>
+                  <w:rFonts w:ascii="Cambria Math" w:hAnsi="Cambria Math"/>
+                </w:rPr>
+                <m:t>Z</m:t>
+              </m:r>
+            </m:sub>
+          </m:sSub>
+          <m:r>
+            <w:rPr>
+              <w:rFonts w:ascii="Cambria Math" w:hAnsi="Cambria Math"/>
+            </w:rPr>
+            <m:t>×</m:t>
+          </m:r>
+          <m:sSub>
+            <m:sSubPr>
+              <m:ctrlPr>
+                <w:rPr>
+                  <w:rFonts w:ascii="Cambria Math" w:hAnsi="Cambria Math"/>
+                </w:rPr>
+              </m:ctrlPr>
+            </m:sSubPr>
+            <m:e>
+              <m:r>
+                <w:rPr>
+                  <w:rFonts w:ascii="Cambria Math" w:hAnsi="Cambria Math"/>
+                </w:rPr>
+                <m:t>q</m:t>
+              </m:r>
+            </m:e>
+            <m:sub>
+              <m:r>
+                <w:rPr>
+                  <w:rFonts w:ascii="Cambria Math" w:hAnsi="Cambria Math"/>
+                </w:rPr>
+                <m:t>Y</m:t>
+              </m:r>
+            </m:sub>
+          </m:sSub>
+          <m:r>
+            <w:rPr>
+              <w:rFonts w:ascii="Cambria Math" w:hAnsi="Cambria Math"/>
+            </w:rPr>
+            <m:t>×</m:t>
+          </m:r>
+          <m:sSub>
+            <m:sSubPr>
+              <m:ctrlPr>
+                <w:rPr>
+                  <w:rFonts w:ascii="Cambria Math" w:hAnsi="Cambria Math"/>
+                </w:rPr>
+              </m:ctrlPr>
+            </m:sSubPr>
+            <m:e>
+              <m:r>
+                <w:rPr>
+                  <w:rFonts w:ascii="Cambria Math" w:hAnsi="Cambria Math"/>
+                </w:rPr>
+                <m:t>q</m:t>
+              </m:r>
+            </m:e>
+            <m:sub>
+              <m:r>
+                <w:rPr>
+                  <w:rFonts w:ascii="Cambria Math" w:hAnsi="Cambria Math"/>
+                </w:rPr>
+                <m:t>X</m:t>
+              </m:r>
+            </m:sub>
+          </m:sSub>
+        </m:oMath>
+      </m:oMathPara>
+    </w:p>
+    <w:p>
+      <w:r>
+        <w:t xml:space="preserve">Twój kod: </w:t>
+      </w:r>
+      <w:proofErr w:type="spellStart"/>
+      <w:r>
+        <w:t>qZ</w:t>
+      </w:r>
+      <w:proofErr w:type="spellEnd"/>
+      <w:r>
+        <w:t xml:space="preserve"> * </w:t>
+      </w:r>
+      <w:proofErr w:type="spellStart"/>
+      <w:r>
+        <w:t>qY</w:t>
+      </w:r>
+      <w:proofErr w:type="spellEnd"/>
+      <w:r>
+        <w:t xml:space="preserve"> * </w:t>
+      </w:r>
+      <w:proofErr w:type="spellStart"/>
+      <w:r>
+        <w:t>qX</w:t>
+      </w:r>
+      <w:proofErr w:type="spellEnd"/>
+      <w:r>
+        <w:t>;</w:t>
+      </w:r>
+      <w:r>
+        <w:t xml:space="preserve"> r</w:t>
+      </w:r>
+      <w:r>
+        <w:t xml:space="preserve">ealizuje dokładnie to równanie. Zatem w układzie globalnym (rodzica) zapis kwaternionów </w:t>
+      </w:r>
+      <w:proofErr w:type="spellStart"/>
+      <w:r>
+        <w:t>qZ</w:t>
+      </w:r>
+      <w:proofErr w:type="spellEnd"/>
+      <w:r>
+        <w:t xml:space="preserve"> * </w:t>
+      </w:r>
+      <w:proofErr w:type="spellStart"/>
+      <w:r>
+        <w:t>qY</w:t>
+      </w:r>
+      <w:proofErr w:type="spellEnd"/>
+      <w:r>
+        <w:t xml:space="preserve"> * </w:t>
+      </w:r>
+      <w:proofErr w:type="spellStart"/>
+      <w:r>
+        <w:t>qX</w:t>
+      </w:r>
+      <w:proofErr w:type="spellEnd"/>
+      <w:r>
+        <w:t xml:space="preserve"> oznacza </w:t>
+      </w:r>
+      <w:r>
+        <w:rPr>
+          <w:b/>
+          <w:bCs/>
+        </w:rPr>
+        <w:t>wykonywanie obrotów od prawej do lewej strony: najpierw X, potem Y, potem Z</w:t>
+      </w:r>
+      <w:r>
+        <w:t>.</w:t>
+      </w:r>
+    </w:p>
+    <w:p/>
     <w:sectPr>
       <w:pgSz w:w="11906" w:h="16838"/>
       <w:pgMar w:top="1417" w:right="1417" w:bottom="1417" w:left="1417" w:header="708" w:footer="708" w:gutter="0"/>
@@ -1206,6 +2153,154 @@
     </w:sectPr>
   </w:body>
 </w:document>
+</file>
+
+<file path=word/numbering.xml><?xml version="1.0" encoding="utf-8"?>
+<w:numbering xmlns:wpc="http://schemas.microsoft.com/office/word/2010/wordprocessingCanvas" xmlns:cx="http://schemas.microsoft.com/office/drawing/2014/chartex" xmlns:cx1="http://schemas.microsoft.com/office/drawing/2015/9/8/chartex" xmlns:cx2="http://schemas.microsoft.com/office/drawing/2015/10/21/chartex" xmlns:cx3="http://schemas.microsoft.com/office/drawing/2016/5/9/chartex" xmlns:cx4="http://schemas.microsoft.com/office/drawing/2016/5/10/chartex" xmlns:cx5="http://schemas.microsoft.com/office/drawing/2016/5/11/chartex" xmlns:cx6="http://schemas.microsoft.com/office/drawing/2016/5/12/chartex" xmlns:cx7="http://schemas.microsoft.com/office/drawing/2016/5/13/chartex" xmlns:cx8="http://schemas.microsoft.com/office/drawing/2016/5/14/chartex" xmlns:mc="http://schemas.openxmlformats.org/markup-compatibility/2006" xmlns:aink="http://schemas.microsoft.com/office/drawing/2016/ink" xmlns:am3d="http://schemas.microsoft.com/office/drawing/2017/model3d" xmlns:o="urn:schemas-microsoft-com:office:office" xmlns:oel="http://schemas.microsoft.com/office/2019/extlst" xmlns:r="http://schemas.openxmlformats.org/officeDocument/2006/relationships" xmlns:m="http://schemas.openxmlformats.org/officeDocument/2006/math" xmlns:v="urn:schemas-microsoft-com:vml" xmlns:wp14="http://schemas.microsoft.com/office/word/2010/wordprocessingDrawing" xmlns:wp="http://schemas.openxmlformats.org/drawingml/2006/wordprocessingDrawing" xmlns:w10="urn:schemas-microsoft-com:office:word" xmlns:w="http://schemas.openxmlformats.org/wordprocessingml/2006/main" xmlns:w14="http://schemas.microsoft.com/office/word/2010/wordml" xmlns:w15="http://schemas.microsoft.com/office/word/2012/wordml" xmlns:w16cex="http://schemas.microsoft.com/office/word/2018/wordml/cex" xmlns:w16cid="http://schemas.microsoft.com/office/word/2016/wordml/cid" xmlns:w16="http://schemas.microsoft.com/office/word/2018/wordml" xmlns:w16du="http://schemas.microsoft.com/office/word/2023/wordml/word16du" xmlns:w16sdtdh="http://schemas.microsoft.com/office/word/2020/wordml/sdtdatahash" xmlns:w16sdtfl="http://schemas.microsoft.com/office/word/2024/wordml/sdtformatlock" xmlns:w16se="http://schemas.microsoft.com/office/word/2015/wordml/symex" xmlns:wpg="http://schemas.microsoft.com/office/word/2010/wordprocessingGroup" xmlns:wpi="http://schemas.microsoft.com/office/word/2010/wordprocessingInk" xmlns:wne="http://schemas.microsoft.com/office/word/2006/wordml" xmlns:wps="http://schemas.microsoft.com/office/word/2010/wordprocessingShape" mc:Ignorable="w14 w15 w16se w16cid w16 w16cex w16sdtdh w16sdtfl w16du wp14">
+  <w:abstractNum w:abstractNumId="0" w15:restartNumberingAfterBreak="0">
+    <w:nsid w:val="4E3C25EF"/>
+    <w:multiLevelType w:val="multilevel"/>
+    <w:tmpl w:val="D668FB96"/>
+    <w:lvl w:ilvl="0">
+      <w:start w:val="1"/>
+      <w:numFmt w:val="decimal"/>
+      <w:lvlText w:val="%1."/>
+      <w:lvlJc w:val="left"/>
+      <w:pPr>
+        <w:tabs>
+          <w:tab w:val="num" w:pos="720"/>
+        </w:tabs>
+        <w:ind w:left="720" w:hanging="360"/>
+      </w:pPr>
+    </w:lvl>
+    <w:lvl w:ilvl="1">
+      <w:start w:val="1"/>
+      <w:numFmt w:val="decimal"/>
+      <w:lvlText w:val="%2."/>
+      <w:lvlJc w:val="left"/>
+      <w:pPr>
+        <w:tabs>
+          <w:tab w:val="num" w:pos="1440"/>
+        </w:tabs>
+        <w:ind w:left="1440" w:hanging="360"/>
+      </w:pPr>
+    </w:lvl>
+    <w:lvl w:ilvl="2">
+      <w:start w:val="1"/>
+      <w:numFmt w:val="decimal"/>
+      <w:lvlText w:val="%3."/>
+      <w:lvlJc w:val="left"/>
+      <w:pPr>
+        <w:tabs>
+          <w:tab w:val="num" w:pos="2160"/>
+        </w:tabs>
+        <w:ind w:left="2160" w:hanging="360"/>
+      </w:pPr>
+    </w:lvl>
+    <w:lvl w:ilvl="3">
+      <w:start w:val="1"/>
+      <w:numFmt w:val="decimal"/>
+      <w:lvlText w:val="%4."/>
+      <w:lvlJc w:val="left"/>
+      <w:pPr>
+        <w:tabs>
+          <w:tab w:val="num" w:pos="2880"/>
+        </w:tabs>
+        <w:ind w:left="2880" w:hanging="360"/>
+      </w:pPr>
+    </w:lvl>
+    <w:lvl w:ilvl="4">
+      <w:start w:val="1"/>
+      <w:numFmt w:val="decimal"/>
+      <w:lvlText w:val="%5."/>
+      <w:lvlJc w:val="left"/>
+      <w:pPr>
+        <w:tabs>
+          <w:tab w:val="num" w:pos="3600"/>
+        </w:tabs>
+        <w:ind w:left="3600" w:hanging="360"/>
+      </w:pPr>
+    </w:lvl>
+    <w:lvl w:ilvl="5">
+      <w:start w:val="1"/>
+      <w:numFmt w:val="decimal"/>
+      <w:lvlText w:val="%6."/>
+      <w:lvlJc w:val="left"/>
+      <w:pPr>
+        <w:tabs>
+          <w:tab w:val="num" w:pos="4320"/>
+        </w:tabs>
+        <w:ind w:left="4320" w:hanging="360"/>
+      </w:pPr>
+    </w:lvl>
+    <w:lvl w:ilvl="6">
+      <w:start w:val="1"/>
+      <w:numFmt w:val="decimal"/>
+      <w:lvlText w:val="%7."/>
+      <w:lvlJc w:val="left"/>
+      <w:pPr>
+        <w:tabs>
+          <w:tab w:val="num" w:pos="5040"/>
+        </w:tabs>
+        <w:ind w:left="5040" w:hanging="360"/>
+      </w:pPr>
+    </w:lvl>
+    <w:lvl w:ilvl="7">
+      <w:start w:val="1"/>
+      <w:numFmt w:val="decimal"/>
+      <w:lvlText w:val="%8."/>
+      <w:lvlJc w:val="left"/>
+      <w:pPr>
+        <w:tabs>
+          <w:tab w:val="num" w:pos="5760"/>
+        </w:tabs>
+        <w:ind w:left="5760" w:hanging="360"/>
+      </w:pPr>
+    </w:lvl>
+    <w:lvl w:ilvl="8">
+      <w:start w:val="1"/>
+      <w:numFmt w:val="decimal"/>
+      <w:lvlText w:val="%9."/>
+      <w:lvlJc w:val="left"/>
+      <w:pPr>
+        <w:tabs>
+          <w:tab w:val="num" w:pos="6480"/>
+        </w:tabs>
+        <w:ind w:left="6480" w:hanging="360"/>
+      </w:pPr>
+    </w:lvl>
+  </w:abstractNum>
+  <w:num w:numId="1" w16cid:durableId="135144937">
+    <w:abstractNumId w:val="0"/>
+    <w:lvlOverride w:ilvl="0">
+      <w:startOverride w:val="1"/>
+    </w:lvlOverride>
+    <w:lvlOverride w:ilvl="1">
+      <w:startOverride w:val="1"/>
+    </w:lvlOverride>
+    <w:lvlOverride w:ilvl="2">
+      <w:startOverride w:val="1"/>
+    </w:lvlOverride>
+    <w:lvlOverride w:ilvl="3">
+      <w:startOverride w:val="1"/>
+    </w:lvlOverride>
+    <w:lvlOverride w:ilvl="4">
+      <w:startOverride w:val="1"/>
+    </w:lvlOverride>
+    <w:lvlOverride w:ilvl="5">
+      <w:startOverride w:val="1"/>
+    </w:lvlOverride>
+    <w:lvlOverride w:ilvl="6">
+      <w:startOverride w:val="1"/>
+    </w:lvlOverride>
+    <w:lvlOverride w:ilvl="7">
+      <w:startOverride w:val="1"/>
+    </w:lvlOverride>
+    <w:lvlOverride w:ilvl="8">
+      <w:startOverride w:val="1"/>
+    </w:lvlOverride>
+  </w:num>
+</w:numbering>
 </file>
 
 <file path=word/styles.xml><?xml version="1.0" encoding="utf-8"?>

</xml_diff>